<commit_message>
Fix particle-selection equation delimiters and archive final Astra verification (0.2-r1)
</commit_message>
<xml_diff>
--- a/submission/particle_selection_v0_2/output/WRRA_Address_Particle_Interface_v0_2_EN.docx
+++ b/submission/particle_selection_v0_2/output/WRRA_Address_Particle_Interface_v0_2_EN.docx
@@ -1170,64 +1170,66 @@
           <m:jc m:val="center"/>
         </m:oMathParaPr>
         <m:oMath>
-          <m:d>
-            <m:dPr>
-              <m:begChr m:val="|"/>
-              <m:endChr m:val="|"/>
-              <m:sepChr m:val=""/>
-              <m:grow/>
-            </m:dPr>
+          <m:r>
+            <m:rPr>
+              <m:sty m:val="p"/>
+            </m:rPr>
+            <m:t>|</m:t>
+          </m:r>
+          <m:sSub>
             <m:e>
-              <m:sSub>
+              <m:r>
+                <m:t>ψ</m:t>
+              </m:r>
+            </m:e>
+            <m:sub>
+              <m:r>
+                <m:t>n</m:t>
+              </m:r>
+            </m:sub>
+          </m:sSub>
+          <m:r>
+            <m:rPr>
+              <m:sty m:val="p"/>
+            </m:rPr>
+            <m:t>⟩</m:t>
+          </m:r>
+          <m:r>
+            <m:rPr>
+              <m:sty m:val="p"/>
+            </m:rPr>
+            <m:t>=</m:t>
+          </m:r>
+          <m:rad>
+            <m:radPr>
+              <m:degHide m:val="on"/>
+            </m:radPr>
+            <m:deg/>
+            <m:e>
+              <m:r>
+                <m:t>χ</m:t>
+              </m:r>
+              <m:d>
+                <m:dPr>
+                  <m:begChr m:val="("/>
+                  <m:endChr m:val=")"/>
+                  <m:sepChr m:val=""/>
+                  <m:grow/>
+                </m:dPr>
                 <m:e>
-                  <m:r>
-                    <m:t>ψ</m:t>
-                  </m:r>
-                </m:e>
-                <m:sub>
                   <m:r>
                     <m:t>n</m:t>
                   </m:r>
-                </m:sub>
-              </m:sSub>
-              <m:r>
-                <m:rPr>
-                  <m:sty m:val="p"/>
-                </m:rPr>
-                <m:t>⟩</m:t>
-              </m:r>
-              <m:r>
-                <m:rPr>
-                  <m:sty m:val="p"/>
-                </m:rPr>
-                <m:t>=</m:t>
-              </m:r>
-              <m:rad>
-                <m:radPr>
-                  <m:degHide m:val="on"/>
-                </m:radPr>
-                <m:deg/>
-                <m:e>
-                  <m:r>
-                    <m:t>χ</m:t>
-                  </m:r>
-                  <m:d>
-                    <m:dPr>
-                      <m:begChr m:val="("/>
-                      <m:endChr m:val=")"/>
-                      <m:sepChr m:val=""/>
-                      <m:grow/>
-                    </m:dPr>
-                    <m:e>
-                      <m:r>
-                        <m:t>n</m:t>
-                      </m:r>
-                    </m:e>
-                  </m:d>
                 </m:e>
-              </m:rad>
+              </m:d>
             </m:e>
-          </m:d>
+          </m:rad>
+          <m:r>
+            <m:rPr>
+              <m:sty m:val="p"/>
+            </m:rPr>
+            <m:t>|</m:t>
+          </m:r>
           <m:r>
             <m:t>e</m:t>
           </m:r>
@@ -1325,31 +1327,33 @@
           <m:r>
             <m:t>V</m:t>
           </m:r>
-          <m:d>
-            <m:dPr>
-              <m:begChr m:val="|"/>
-              <m:endChr m:val="|"/>
-              <m:sepChr m:val=""/>
-              <m:grow/>
-            </m:dPr>
-            <m:e>
-              <m:r>
-                <m:t>n</m:t>
-              </m:r>
-              <m:r>
-                <m:rPr>
-                  <m:sty m:val="p"/>
-                </m:rPr>
-                <m:t>⟩</m:t>
-              </m:r>
-              <m:r>
-                <m:rPr>
-                  <m:sty m:val="p"/>
-                </m:rPr>
-                <m:t>=</m:t>
-              </m:r>
-            </m:e>
-          </m:d>
+          <m:r>
+            <m:rPr>
+              <m:sty m:val="p"/>
+            </m:rPr>
+            <m:t>|</m:t>
+          </m:r>
+          <m:r>
+            <m:t>n</m:t>
+          </m:r>
+          <m:r>
+            <m:rPr>
+              <m:sty m:val="p"/>
+            </m:rPr>
+            <m:t>⟩</m:t>
+          </m:r>
+          <m:r>
+            <m:rPr>
+              <m:sty m:val="p"/>
+            </m:rPr>
+            <m:t>=</m:t>
+          </m:r>
+          <m:r>
+            <m:rPr>
+              <m:sty m:val="p"/>
+            </m:rPr>
+            <m:t>|</m:t>
+          </m:r>
           <m:r>
             <m:t>n</m:t>
           </m:r>
@@ -1562,34 +1566,36 @@
               </m:r>
             </m:e>
           </m:d>
-          <m:d>
-            <m:dPr>
-              <m:begChr m:val="|"/>
-              <m:endChr m:val="|"/>
-              <m:sepChr m:val=""/>
-              <m:grow/>
-            </m:dPr>
-            <m:e>
-              <m:r>
-                <m:t>n</m:t>
-              </m:r>
-              <m:r>
-                <m:rPr>
-                  <m:sty m:val="p"/>
-                </m:rPr>
-                <m:t>⟩</m:t>
-              </m:r>
-              <m:r>
-                <m:rPr>
-                  <m:sty m:val="p"/>
-                </m:rPr>
-                <m:t>⟨</m:t>
-              </m:r>
-              <m:r>
-                <m:t>n</m:t>
-              </m:r>
-            </m:e>
-          </m:d>
+          <m:r>
+            <m:rPr>
+              <m:sty m:val="p"/>
+            </m:rPr>
+            <m:t>|</m:t>
+          </m:r>
+          <m:r>
+            <m:t>n</m:t>
+          </m:r>
+          <m:r>
+            <m:rPr>
+              <m:sty m:val="p"/>
+            </m:rPr>
+            <m:t>⟩</m:t>
+          </m:r>
+          <m:r>
+            <m:rPr>
+              <m:sty m:val="p"/>
+            </m:rPr>
+            <m:t>⟨</m:t>
+          </m:r>
+          <m:r>
+            <m:t>n</m:t>
+          </m:r>
+          <m:r>
+            <m:rPr>
+              <m:sty m:val="p"/>
+            </m:rPr>
+            <m:t>|</m:t>
+          </m:r>
           <m:r>
             <m:rPr>
               <m:sty m:val="p"/>
@@ -1907,14 +1913,59 @@
           <m:r>
             <m:t>2</m:t>
           </m:r>
+          <m:r>
+            <m:rPr>
+              <m:sty m:val="p"/>
+            </m:rPr>
+            <m:t>[</m:t>
+          </m:r>
+          <m:sSub>
+            <m:e>
+              <m:r>
+                <m:t>X</m:t>
+              </m:r>
+            </m:e>
+            <m:sub>
+              <m:r>
+                <m:t>d</m:t>
+              </m:r>
+            </m:sub>
+          </m:sSub>
+          <m:sSub>
+            <m:e>
+              <m:r>
+                <m:t>ε</m:t>
+              </m:r>
+            </m:e>
+            <m:sub>
+              <m:r>
+                <m:t>e</m:t>
+              </m:r>
+            </m:sub>
+          </m:sSub>
+          <m:r>
+            <m:rPr>
+              <m:sty m:val="p"/>
+            </m:rPr>
+            <m:t>+</m:t>
+          </m:r>
           <m:d>
             <m:dPr>
-              <m:begChr m:val="["/>
-              <m:endChr m:val="]"/>
+              <m:begChr m:val="("/>
+              <m:endChr m:val=")"/>
               <m:sepChr m:val=""/>
               <m:grow/>
             </m:dPr>
             <m:e>
+              <m:r>
+                <m:t>1</m:t>
+              </m:r>
+              <m:r>
+                <m:rPr>
+                  <m:sty m:val="p"/>
+                </m:rPr>
+                <m:t>−</m:t>
+              </m:r>
               <m:sSub>
                 <m:e>
                   <m:r>
@@ -1927,69 +1978,26 @@
                   </m:r>
                 </m:sub>
               </m:sSub>
-              <m:sSub>
-                <m:e>
-                  <m:r>
-                    <m:t>ε</m:t>
-                  </m:r>
-                </m:e>
-                <m:sub>
-                  <m:r>
-                    <m:t>e</m:t>
-                  </m:r>
-                </m:sub>
-              </m:sSub>
-              <m:r>
-                <m:rPr>
-                  <m:sty m:val="p"/>
-                </m:rPr>
-                <m:t>+</m:t>
-              </m:r>
-              <m:d>
-                <m:dPr>
-                  <m:begChr m:val="("/>
-                  <m:endChr m:val=")"/>
-                  <m:sepChr m:val=""/>
-                  <m:grow/>
-                </m:dPr>
-                <m:e>
-                  <m:r>
-                    <m:t>1</m:t>
-                  </m:r>
-                  <m:r>
-                    <m:rPr>
-                      <m:sty m:val="p"/>
-                    </m:rPr>
-                    <m:t>−</m:t>
-                  </m:r>
-                  <m:sSub>
-                    <m:e>
-                      <m:r>
-                        <m:t>X</m:t>
-                      </m:r>
-                    </m:e>
-                    <m:sub>
-                      <m:r>
-                        <m:t>d</m:t>
-                      </m:r>
-                    </m:sub>
-                  </m:sSub>
-                </m:e>
-              </m:d>
-              <m:sSub>
-                <m:e>
-                  <m:r>
-                    <m:t>ε</m:t>
-                  </m:r>
-                </m:e>
-                <m:sub>
-                  <m:r>
-                    <m:t>μ</m:t>
-                  </m:r>
-                </m:sub>
-              </m:sSub>
             </m:e>
           </m:d>
+          <m:sSub>
+            <m:e>
+              <m:r>
+                <m:t>ε</m:t>
+              </m:r>
+            </m:e>
+            <m:sub>
+              <m:r>
+                <m:t>μ</m:t>
+              </m:r>
+            </m:sub>
+          </m:sSub>
+          <m:r>
+            <m:rPr>
+              <m:sty m:val="p"/>
+            </m:rPr>
+            <m:t>]</m:t>
+          </m:r>
           <m:r>
             <m:rPr>
               <m:sty m:val="p"/>
@@ -3020,121 +3028,123 @@
           <m:r>
             <m:t>0.05</m:t>
           </m:r>
-          <m:d>
-            <m:dPr>
-              <m:begChr m:val="["/>
-              <m:endChr m:val="]"/>
-              <m:sepChr m:val=""/>
-              <m:grow/>
-            </m:dPr>
+          <m:r>
+            <m:rPr>
+              <m:sty m:val="p"/>
+            </m:rPr>
+            <m:t>[</m:t>
+          </m:r>
+          <m:sSub>
             <m:e>
-              <m:sSub>
-                <m:e>
-                  <m:r>
-                    <m:t>X</m:t>
-                  </m:r>
-                </m:e>
-                <m:sub>
-                  <m:r>
-                    <m:t>d</m:t>
-                  </m:r>
-                </m:sub>
-              </m:sSub>
-              <m:rad>
-                <m:radPr>
-                  <m:degHide m:val="on"/>
-                </m:radPr>
-                <m:deg/>
-                <m:e>
-                  <m:r>
-                    <m:t>r</m:t>
-                  </m:r>
-                  <m:r>
-                    <m:rPr>
-                      <m:sty m:val="p"/>
-                    </m:rPr>
-                    <m:t>+</m:t>
-                  </m:r>
-                  <m:d>
-                    <m:dPr>
-                      <m:begChr m:val="("/>
-                      <m:endChr m:val=")"/>
-                      <m:sepChr m:val=""/>
-                      <m:grow/>
-                    </m:dPr>
-                    <m:e>
-                      <m:r>
-                        <m:t>1</m:t>
-                      </m:r>
-                      <m:r>
-                        <m:rPr>
-                          <m:sty m:val="p"/>
-                        </m:rPr>
-                        <m:t>−</m:t>
-                      </m:r>
-                      <m:r>
-                        <m:t>r</m:t>
-                      </m:r>
-                    </m:e>
-                  </m:d>
-                  <m:sSup>
-                    <m:e>
-                      <m:r>
-                        <m:t>v</m:t>
-                      </m:r>
-                    </m:e>
-                    <m:sup>
-                      <m:r>
-                        <m:rPr>
-                          <m:sty m:val="p"/>
-                        </m:rPr>
-                        <m:t>−</m:t>
-                      </m:r>
-                      <m:r>
-                        <m:t>2</m:t>
-                      </m:r>
-                      <m:r>
-                        <m:rPr>
-                          <m:sty m:val="p"/>
-                        </m:rPr>
-                        <m:t>/</m:t>
-                      </m:r>
-                      <m:r>
-                        <m:t>3</m:t>
-                      </m:r>
-                    </m:sup>
-                  </m:sSup>
-                </m:e>
-              </m:rad>
+              <m:r>
+                <m:t>X</m:t>
+              </m:r>
+            </m:e>
+            <m:sub>
+              <m:r>
+                <m:t>d</m:t>
+              </m:r>
+            </m:sub>
+          </m:sSub>
+          <m:rad>
+            <m:radPr>
+              <m:degHide m:val="on"/>
+            </m:radPr>
+            <m:deg/>
+            <m:e>
+              <m:r>
+                <m:t>r</m:t>
+              </m:r>
               <m:r>
                 <m:rPr>
                   <m:sty m:val="p"/>
                 </m:rPr>
                 <m:t>+</m:t>
               </m:r>
-              <m:r>
-                <m:t>1</m:t>
-              </m:r>
-              <m:r>
-                <m:rPr>
-                  <m:sty m:val="p"/>
-                </m:rPr>
-                <m:t>−</m:t>
-              </m:r>
-              <m:sSub>
+              <m:d>
+                <m:dPr>
+                  <m:begChr m:val="("/>
+                  <m:endChr m:val=")"/>
+                  <m:sepChr m:val=""/>
+                  <m:grow/>
+                </m:dPr>
                 <m:e>
                   <m:r>
-                    <m:t>X</m:t>
+                    <m:t>1</m:t>
+                  </m:r>
+                  <m:r>
+                    <m:rPr>
+                      <m:sty m:val="p"/>
+                    </m:rPr>
+                    <m:t>−</m:t>
+                  </m:r>
+                  <m:r>
+                    <m:t>r</m:t>
                   </m:r>
                 </m:e>
-                <m:sub>
+              </m:d>
+              <m:sSup>
+                <m:e>
                   <m:r>
-                    <m:t>d</m:t>
+                    <m:t>v</m:t>
                   </m:r>
-                </m:sub>
-              </m:sSub>
+                </m:e>
+                <m:sup>
+                  <m:r>
+                    <m:rPr>
+                      <m:sty m:val="p"/>
+                    </m:rPr>
+                    <m:t>−</m:t>
+                  </m:r>
+                  <m:r>
+                    <m:t>2</m:t>
+                  </m:r>
+                  <m:r>
+                    <m:rPr>
+                      <m:sty m:val="p"/>
+                    </m:rPr>
+                    <m:t>/</m:t>
+                  </m:r>
+                  <m:r>
+                    <m:t>3</m:t>
+                  </m:r>
+                </m:sup>
+              </m:sSup>
             </m:e>
-          </m:d>
+          </m:rad>
+          <m:r>
+            <m:rPr>
+              <m:sty m:val="p"/>
+            </m:rPr>
+            <m:t>+</m:t>
+          </m:r>
+          <m:r>
+            <m:t>1</m:t>
+          </m:r>
+          <m:r>
+            <m:rPr>
+              <m:sty m:val="p"/>
+            </m:rPr>
+            <m:t>−</m:t>
+          </m:r>
+          <m:sSub>
+            <m:e>
+              <m:r>
+                <m:t>X</m:t>
+              </m:r>
+            </m:e>
+            <m:sub>
+              <m:r>
+                <m:t>d</m:t>
+              </m:r>
+            </m:sub>
+          </m:sSub>
+          <m:r>
+            <m:rPr>
+              <m:sty m:val="p"/>
+            </m:rPr>
+            <m:t>]</m:t>
+          </m:r>
           <m:r>
             <m:rPr>
               <m:sty m:val="p"/>
@@ -3341,77 +3351,79 @@
               </m:r>
             </m:den>
           </m:f>
-          <m:d>
-            <m:dPr>
-              <m:begChr m:val="["/>
-              <m:endChr m:val="]"/>
-              <m:sepChr m:val=""/>
-              <m:grow/>
-            </m:dPr>
-            <m:e>
+          <m:r>
+            <m:rPr>
+              <m:sty m:val="p"/>
+            </m:rPr>
+            <m:t>[</m:t>
+          </m:r>
+          <m:r>
+            <m:t>1</m:t>
+          </m:r>
+          <m:r>
+            <m:rPr>
+              <m:sty m:val="p"/>
+            </m:rPr>
+            <m:t>+</m:t>
+          </m:r>
+          <m:f>
+            <m:fPr>
+              <m:type m:val="bar"/>
+            </m:fPr>
+            <m:num>
               <m:r>
-                <m:t>1</m:t>
+                <m:t>3</m:t>
               </m:r>
               <m:r>
                 <m:rPr>
                   <m:sty m:val="p"/>
+                  <m:scr m:val="script"/>
                 </m:rPr>
-                <m:t>+</m:t>
+                <m:t>P</m:t>
               </m:r>
-              <m:f>
-                <m:fPr>
-                  <m:type m:val="bar"/>
-                </m:fPr>
-                <m:num>
+              <m:d>
+                <m:dPr>
+                  <m:begChr m:val="("/>
+                  <m:endChr m:val=")"/>
+                  <m:sepChr m:val=""/>
+                  <m:grow/>
+                </m:dPr>
+                <m:e>
                   <m:r>
-                    <m:t>3</m:t>
+                    <m:t>1</m:t>
                   </m:r>
+                </m:e>
+              </m:d>
+            </m:num>
+            <m:den>
+              <m:r>
+                <m:rPr>
+                  <m:sty m:val="p"/>
+                  <m:scr m:val="script"/>
+                </m:rPr>
+                <m:t>E</m:t>
+              </m:r>
+              <m:d>
+                <m:dPr>
+                  <m:begChr m:val="("/>
+                  <m:endChr m:val=")"/>
+                  <m:sepChr m:val=""/>
+                  <m:grow/>
+                </m:dPr>
+                <m:e>
                   <m:r>
-                    <m:rPr>
-                      <m:sty m:val="p"/>
-                      <m:scr m:val="script"/>
-                    </m:rPr>
-                    <m:t>P</m:t>
+                    <m:t>1</m:t>
                   </m:r>
-                  <m:d>
-                    <m:dPr>
-                      <m:begChr m:val="("/>
-                      <m:endChr m:val=")"/>
-                      <m:sepChr m:val=""/>
-                      <m:grow/>
-                    </m:dPr>
-                    <m:e>
-                      <m:r>
-                        <m:t>1</m:t>
-                      </m:r>
-                    </m:e>
-                  </m:d>
-                </m:num>
-                <m:den>
-                  <m:r>
-                    <m:rPr>
-                      <m:sty m:val="p"/>
-                      <m:scr m:val="script"/>
-                    </m:rPr>
-                    <m:t>E</m:t>
-                  </m:r>
-                  <m:d>
-                    <m:dPr>
-                      <m:begChr m:val="("/>
-                      <m:endChr m:val=")"/>
-                      <m:sepChr m:val=""/>
-                      <m:grow/>
-                    </m:dPr>
-                    <m:e>
-                      <m:r>
-                        <m:t>1</m:t>
-                      </m:r>
-                    </m:e>
-                  </m:d>
-                </m:den>
-              </m:f>
-            </m:e>
-          </m:d>
+                </m:e>
+              </m:d>
+            </m:den>
+          </m:f>
+          <m:r>
+            <m:rPr>
+              <m:sty m:val="p"/>
+            </m:rPr>
+            <m:t>]</m:t>
+          </m:r>
           <m:r>
             <m:rPr>
               <m:sty m:val="p"/>

</xml_diff>